<commit_message>
feat: add spoken commentary to the demonstration video
tools/narration.json holds the commentary; make_narration.py speaks it
with Piper TTS; record_video.js paces each part by its clip and marks
clip starts with a grey corner square; mix_narration.py finds those
markers in the recording (which does not run exactly in real time) and
adds the sound there. The report declares the synthetic voice.

Co-Authored-By: Claude Opus 5.5 <noreply@anthropic.com>
Claude-Session: https://claude.ai/code/session_01XD7kt4NUT5bnr3NetjtefG
</commit_message>
<xml_diff>
--- a/docs/ia/IA_Driving_Theory_Practice.docx
+++ b/docs/ia/IA_Driving_Theory_Practice.docx
@@ -30843,7 +30843,7 @@
         <w:spacing w:after="100"/>
       </w:pPr>
       <w:r>
-        <w:t xml:space="preserve">[TO REVIEW AND COMPLETE BY THE CANDIDATE] Claude (Anthropic), an AI assistant, was used in October 2026 to check this report against the code, to write the automated tests (tests/), the test-data generator (tools/make_test_data.py) and the shuffle comparison (tools/compare_shuffles.js), to fix the three defects described in Criterion D, to generate the diagrams in docs/ia/, to record the demonstration video with tools/record_video.js and to draft the text of this report. Every statement about the product was checked against the source code and tests/results.json. [Add: any other AI use, e.g. for the English translation of the question bank (tools/translations/), with the prompts and dates.]</w:t>
+        <w:t xml:space="preserve">[TO REVIEW AND COMPLETE BY THE CANDIDATE] Claude (Anthropic), an AI assistant, was used in October 2026 to check this report against the code, to write the automated tests (tests/), the test-data generator (tools/make_test_data.py) and the shuffle comparison (tools/compare_shuffles.js), to fix the three defects described in Criterion D, to generate the diagrams in docs/ia/, to record the demonstration video with tools/record_video.js, to write its commentary (tools/narration.json), which is spoken by a synthetic text-to-speech voice (Piper, voice en_US-lessac-high), and to draft the text of this report. Every statement about the product was checked against the source code and tests/results.json. [Add: any other AI use, e.g. for the English translation of the question bank (tools/translations/), with the prompts and dates.]</w:t>
       </w:r>
     </w:p>
     <w:p>
@@ -30859,7 +30859,7 @@
         <w:spacing w:after="100"/>
       </w:pPr>
       <w:r>
-        <w:t xml:space="preserve">Appendix A — Full source code with line numbers (IA_Appendix_A_Source_Code.docx). Appendix B — Test code, test data and full results (tests/). Video — IA_video_Driving_Theory_Practice.mp4: every success criterion named and then shown working, with examples of structural and functional testing (recorded by tools/record_video.js; under 5 minutes).</w:t>
+        <w:t xml:space="preserve">Appendix A — Full source code with line numbers (IA_Appendix_A_Source_Code.docx). Appendix B — Test code, test data and full results (tests/). Video — IA_video_Driving_Theory_Practice_narrated.mp4: every success criterion named and then shown working, with examples of structural and functional testing and a spoken commentary in a synthetic voice (recorded by tools/record_video.js; 4:23).</w:t>
       </w:r>
     </w:p>
     <w:sectPr>

</xml_diff>

<commit_message>
feat: final video with the candidate's own commentary
- prepare_recordings.py: gentle background-noise reduction (afftdn)
- record_video.js: the title card names the commentary source only
  when the narration folder declares one (source.txt), so a recording
  of a real voice is not labelled as synthetic
- make_narration.py writes that declaration for the TTS voice
- report: video name, length and AI acknowledgement updated

Co-Authored-By: Claude Opus 5.5 <noreply@anthropic.com>
Claude-Session: https://claude.ai/code/session_01XD7kt4NUT5bnr3NetjtefG
</commit_message>
<xml_diff>
--- a/docs/ia/IA_Driving_Theory_Practice.docx
+++ b/docs/ia/IA_Driving_Theory_Practice.docx
@@ -17524,7 +17524,7 @@
         <w:t xml:space="preserve">Evaluation.</w:t>
       </w:r>
       <w:r>
-        <w:t xml:space="preserve"> Splitting the text on line breaks and then on commas is simpler but fails on this data: 48 questions in db.lt.csv contain a line break inside a quoted field and 131 contain a comma in the question or an option, so their columns would shift. The PapaParse library [5] would handle this but adds a dependency and hides the algorithm. One pass is O(n) in the length of the file; 500 questions loaded in 26 ms (F14). A weakness remains: an unclosed quote turns the rest of the file into one field, and the faulty line is not reported.</w:t>
+        <w:t xml:space="preserve"> Splitting the text on line breaks and then on commas is simpler but fails on this data: 48 questions in db.lt.csv contain a line break inside a quoted field and 131 contain a comma in the question or an option, so their columns would shift. The PapaParse library [5] would handle this but adds a dependency and hides the algorithm. One pass is O(n) in the length of the file; 500 questions loaded in 16 ms (F14). A weakness remains: an unclosed quote turns the rest of the file into one field, and the faulty line is not reported.</w:t>
       </w:r>
     </w:p>
     <w:p>
@@ -17859,7 +17859,7 @@
         <w:t xml:space="preserve">Testing.</w:t>
       </w:r>
       <w:r>
-        <w:t xml:space="preserve"> S9–S14 and F3–F5. In S10 each of the six orders appeared 9,904–10,140 times.</w:t>
+        <w:t xml:space="preserve"> S9–S14 and F3–F5. In S10 each of the six orders appeared 9,790–10,182 times.</w:t>
       </w:r>
     </w:p>
     <w:p>
@@ -22140,7 +22140,7 @@
                 <w:sz w:val="17"/>
                 <w:szCs w:val="17"/>
               </w:rPr>
-              <w:t xml:space="preserve">123: 10140, 132: 9966, 213: 9943, 231: 10104, 312: 9943, 321: 9904</w:t>
+              <w:t xml:space="preserve">123: 10016, 132: 10182, 213: 10012, 231: 9790, 312: 9850, 321: 10150</w:t>
             </w:r>
           </w:p>
         </w:tc>
@@ -25572,7 +25572,7 @@
           <w:sz w:val="18"/>
           <w:szCs w:val="18"/>
         </w:rPr>
-        <w:t xml:space="preserve">Table D2 — Structural test results (2026-10-08, Chromium 141.0.7390.37)</w:t>
+        <w:t xml:space="preserve">Table D2 — Structural test results (2026-10-09, Chromium 141.0.7390.37)</w:t>
       </w:r>
     </w:p>
     <w:tbl>
@@ -27250,7 +27250,7 @@
                 <w:sz w:val="17"/>
                 <w:szCs w:val="17"/>
               </w:rPr>
-              <w:t xml:space="preserve">score 39 of 60 (65%); correct 20 + incorrect 10; Easy 7/10 (70%), Medium 7/10 (70%), Hard 6/10 (60%)</w:t>
+              <w:t xml:space="preserve">score 41 of 60 (68%); correct 20 + incorrect 10; Easy 6/10 (60%), Medium 7/10 (70%), Hard 7/10 (70%)</w:t>
             </w:r>
           </w:p>
         </w:tc>
@@ -27510,7 +27510,7 @@
                 <w:sz w:val="17"/>
                 <w:szCs w:val="17"/>
               </w:rPr>
-              <w:t xml:space="preserve">loaded in 26 ms (upload to message); slowest answer 0.4 ms</w:t>
+              <w:t xml:space="preserve">loaded in 16 ms (upload to message); slowest answer 0.5 ms</w:t>
             </w:r>
           </w:p>
         </w:tc>
@@ -27640,7 +27640,7 @@
                 <w:sz w:val="17"/>
                 <w:szCs w:val="17"/>
               </w:rPr>
-              <w:t xml:space="preserve">Start ready after 72 ms; 1 click to start; visible on every question: true</w:t>
+              <w:t xml:space="preserve">Start ready after 67 ms; 1 click to start; visible on every question: true</w:t>
             </w:r>
           </w:p>
         </w:tc>
@@ -28861,7 +28861,7 @@
           <w:sz w:val="18"/>
           <w:szCs w:val="18"/>
         </w:rPr>
-        <w:t xml:space="preserve">Table D3 — Functional test results (2026-10-08, Chromium 141.0.7390.37)</w:t>
+        <w:t xml:space="preserve">Table D3 — Functional test results (2026-10-09, Chromium 141.0.7390.37)</w:t>
       </w:r>
     </w:p>
     <w:p>
@@ -30065,7 +30065,7 @@
                 <w:sz w:val="17"/>
                 <w:szCs w:val="17"/>
               </w:rPr>
-              <w:t xml:space="preserve">F14: 26 ms load, 0.4 ms per answer, on a fast computer; not yet measured on a school laptop.</w:t>
+              <w:t xml:space="preserve">F14: 16 ms load, 0.5 ms per answer, on a fast computer; not yet measured on a school laptop.</w:t>
             </w:r>
           </w:p>
         </w:tc>
@@ -30593,7 +30593,7 @@
         <w:t xml:space="preserve">Math.floor</w:t>
       </w:r>
       <w:r>
-        <w:t xml:space="preserve"> rounds down rather than to the nearest second. Portability is partly met, because the product has run only in Chromium on Linux, and the performance margins (26 ms against 2,000 ms) were measured on a fast computer, not a school laptop. Reliability is the strongest result: testing found three defects, one of which made the product unusable offline, and all were fixed.</w:t>
+        <w:t xml:space="preserve"> rounds down rather than to the nearest second. Portability is partly met, because the product has run only in Chromium on Linux, and the performance margins (16 ms against 2,000 ms) were measured on a fast computer, not a school laptop. Reliability is the strongest result: testing found three defects, one of which made the product unusable offline, and all were fixed.</w:t>
       </w:r>
     </w:p>
     <w:p>
@@ -30843,7 +30843,7 @@
         <w:spacing w:after="100"/>
       </w:pPr>
       <w:r>
-        <w:t xml:space="preserve">[TO REVIEW AND COMPLETE BY THE CANDIDATE] Claude (Anthropic), an AI assistant, was used in October 2026 to check this report against the code, to write the automated tests (tests/), the test-data generator (tools/make_test_data.py) and the shuffle comparison (tools/compare_shuffles.js), to fix the three defects described in Criterion D, to generate the diagrams in docs/ia/, to record the demonstration video with tools/record_video.js, to write its commentary (tools/narration.json), which is spoken by a synthetic text-to-speech voice (Piper, voice en_US-lessac-high), and to draft the text of this report. Every statement about the product was checked against the source code and tests/results.json. [Add: any other AI use, e.g. for the English translation of the question bank (tools/translations/), with the prompts and dates.]</w:t>
+        <w:t xml:space="preserve">[TO REVIEW AND COMPLETE BY THE CANDIDATE] Claude (Anthropic), an AI assistant, was used in October 2026 to check this report against the code, to write the automated tests (tests/), the test-data generator (tools/make_test_data.py) and the shuffle comparison (tools/compare_shuffles.js), to fix the three defects described in Criterion D, to generate the diagrams in docs/ia/, to record the demonstration video with tools/record_video.js, to draft the text of its commentary (tools/narration.json), which the candidate recorded in her own voice, and to draft the text of this report. Every statement about the product was checked against the source code and tests/results.json. [Add: any other AI use, e.g. for the English translation of the question bank (tools/translations/), with the prompts and dates.]</w:t>
       </w:r>
     </w:p>
     <w:p>
@@ -30859,7 +30859,7 @@
         <w:spacing w:after="100"/>
       </w:pPr>
       <w:r>
-        <w:t xml:space="preserve">Appendix A — Full source code with line numbers (IA_Appendix_A_Source_Code.docx). Appendix B — Test code, test data and full results (tests/). Video — IA_video_Driving_Theory_Practice_narrated.mp4: every success criterion named and then shown working, with examples of structural and functional testing and a spoken commentary in a synthetic voice (recorded by tools/record_video.js; 4:23).</w:t>
+        <w:t xml:space="preserve">Appendix A — Full source code with line numbers (IA_Appendix_A_Source_Code.docx). Appendix B — Test code, test data and full results (tests/). Video — IA_video_Driving_Theory_Practice.mp4: every success criterion named and then shown working, with examples of structural and functional testing and a spoken commentary recorded by the candidate (screen recorded by tools/record_video.js; 3:16).</w:t>
       </w:r>
     </w:p>
     <w:sectPr>

</xml_diff>